<commit_message>
organized and updated files
</commit_message>
<xml_diff>
--- a/Sem-8/NLP/Lab Record/23BAI10917-NLP-Lab-Record-FINAL.docx
+++ b/Sem-8/NLP/Lab Record/23BAI10917-NLP-Lab-Record-FINAL.docx
@@ -20003,25 +20003,7 @@
           <w:szCs w:val="24"/>
           <w:lang w:val="en-IN"/>
         </w:rPr>
-        <w:t xml:space="preserve">3. To </w:t>
-      </w:r>
-      <w:r>
-        <w:rPr>
-          <w:rFonts w:ascii="Century Schoolbook" w:hAnsi="Century Schoolbook"/>
-          <w:sz w:val="24"/>
-          <w:szCs w:val="24"/>
-          <w:lang w:val="en-IN"/>
-        </w:rPr>
-        <w:t>analyse</w:t>
-      </w:r>
-      <w:r>
-        <w:rPr>
-          <w:rFonts w:ascii="Century Schoolbook" w:hAnsi="Century Schoolbook"/>
-          <w:sz w:val="24"/>
-          <w:szCs w:val="24"/>
-          <w:lang w:val="en-IN"/>
-        </w:rPr>
-        <w:t xml:space="preserve"> differences between inflectional patterns in both languages  </w:t>
+        <w:t xml:space="preserve">3. To analyse differences between inflectional patterns in both languages  </w:t>
       </w:r>
     </w:p>
     <w:p>
@@ -20702,6 +20684,285 @@
     </w:p>
     <w:p>
       <w:pPr>
+        <w:pStyle w:val="BodyText"/>
+        <w:spacing w:before="208"/>
+        <w:rPr>
+          <w:rFonts w:ascii="Century Schoolbook" w:hAnsi="Century Schoolbook"/>
+          <w:bCs/>
+          <w:lang w:val="en-IN"/>
+        </w:rPr>
+      </w:pPr>
+      <w:r>
+        <w:rPr>
+          <w:rFonts w:ascii="Century Schoolbook" w:hAnsi="Century Schoolbook"/>
+          <w:bCs/>
+          <w:lang w:val="en-IN"/>
+        </w:rPr>
+        <w:t xml:space="preserve">1. Input training text </w:t>
+      </w:r>
+    </w:p>
+    <w:p>
+      <w:pPr>
+        <w:pStyle w:val="BodyText"/>
+        <w:spacing w:before="208"/>
+        <w:rPr>
+          <w:rFonts w:ascii="Century Schoolbook" w:hAnsi="Century Schoolbook"/>
+          <w:bCs/>
+          <w:lang w:val="en-IN"/>
+        </w:rPr>
+      </w:pPr>
+      <w:r>
+        <w:rPr>
+          <w:rFonts w:ascii="Century Schoolbook" w:hAnsi="Century Schoolbook"/>
+          <w:bCs/>
+          <w:lang w:val="en-IN"/>
+        </w:rPr>
+        <w:t xml:space="preserve">2. Preprocess text (tokenization, cleaning) </w:t>
+      </w:r>
+    </w:p>
+    <w:p>
+      <w:pPr>
+        <w:pStyle w:val="BodyText"/>
+        <w:spacing w:before="208"/>
+        <w:rPr>
+          <w:rFonts w:ascii="Century Schoolbook" w:hAnsi="Century Schoolbook"/>
+          <w:bCs/>
+          <w:lang w:val="en-IN"/>
+        </w:rPr>
+      </w:pPr>
+      <w:r>
+        <w:rPr>
+          <w:rFonts w:ascii="Century Schoolbook" w:hAnsi="Century Schoolbook"/>
+          <w:bCs/>
+          <w:lang w:val="en-IN"/>
+        </w:rPr>
+        <w:t xml:space="preserve">3. Generate N-grams from the text </w:t>
+      </w:r>
+    </w:p>
+    <w:p>
+      <w:pPr>
+        <w:pStyle w:val="BodyText"/>
+        <w:spacing w:before="208"/>
+        <w:rPr>
+          <w:rFonts w:ascii="Century Schoolbook" w:hAnsi="Century Schoolbook"/>
+          <w:bCs/>
+          <w:lang w:val="en-IN"/>
+        </w:rPr>
+      </w:pPr>
+      <w:r>
+        <w:rPr>
+          <w:rFonts w:ascii="Century Schoolbook" w:hAnsi="Century Schoolbook"/>
+          <w:bCs/>
+          <w:lang w:val="en-IN"/>
+        </w:rPr>
+        <w:t xml:space="preserve">4. Calculate probability distribution of words </w:t>
+      </w:r>
+    </w:p>
+    <w:p>
+      <w:pPr>
+        <w:pStyle w:val="BodyText"/>
+        <w:spacing w:before="208"/>
+        <w:rPr>
+          <w:rFonts w:ascii="Century Schoolbook" w:hAnsi="Century Schoolbook"/>
+          <w:bCs/>
+          <w:lang w:val="en-IN"/>
+        </w:rPr>
+      </w:pPr>
+      <w:r>
+        <w:rPr>
+          <w:rFonts w:ascii="Century Schoolbook" w:hAnsi="Century Schoolbook"/>
+          <w:bCs/>
+          <w:lang w:val="en-IN"/>
+        </w:rPr>
+        <w:t xml:space="preserve">5. Select initial word (seed) </w:t>
+      </w:r>
+    </w:p>
+    <w:p>
+      <w:pPr>
+        <w:pStyle w:val="BodyText"/>
+        <w:spacing w:before="208"/>
+        <w:rPr>
+          <w:rFonts w:ascii="Century Schoolbook" w:hAnsi="Century Schoolbook"/>
+          <w:bCs/>
+          <w:lang w:val="en-IN"/>
+        </w:rPr>
+      </w:pPr>
+      <w:r>
+        <w:rPr>
+          <w:rFonts w:ascii="Century Schoolbook" w:hAnsi="Century Schoolbook"/>
+          <w:bCs/>
+          <w:lang w:val="en-IN"/>
+        </w:rPr>
+        <w:t xml:space="preserve">6. Predict next word based on probabilities </w:t>
+      </w:r>
+    </w:p>
+    <w:p>
+      <w:pPr>
+        <w:pStyle w:val="BodyText"/>
+        <w:spacing w:before="208"/>
+        <w:rPr>
+          <w:rFonts w:ascii="Century Schoolbook" w:hAnsi="Century Schoolbook"/>
+          <w:bCs/>
+          <w:lang w:val="en-IN"/>
+        </w:rPr>
+      </w:pPr>
+      <w:r>
+        <w:rPr>
+          <w:rFonts w:ascii="Century Schoolbook" w:hAnsi="Century Schoolbook"/>
+          <w:bCs/>
+          <w:lang w:val="en-IN"/>
+        </w:rPr>
+        <w:t xml:space="preserve">7. Append predicted word to sequence </w:t>
+      </w:r>
+    </w:p>
+    <w:p>
+      <w:pPr>
+        <w:pStyle w:val="BodyText"/>
+        <w:spacing w:before="208"/>
+        <w:rPr>
+          <w:rFonts w:ascii="Century Schoolbook" w:hAnsi="Century Schoolbook"/>
+          <w:bCs/>
+          <w:lang w:val="en-IN"/>
+        </w:rPr>
+      </w:pPr>
+      <w:r>
+        <w:rPr>
+          <w:rFonts w:ascii="Century Schoolbook" w:hAnsi="Century Schoolbook"/>
+          <w:bCs/>
+          <w:lang w:val="en-IN"/>
+        </w:rPr>
+        <w:t xml:space="preserve">8. Repeat until desired length is achieved </w:t>
+      </w:r>
+    </w:p>
+    <w:p>
+      <w:pPr>
+        <w:pStyle w:val="BodyText"/>
+        <w:spacing w:before="208"/>
+        <w:rPr>
+          <w:rFonts w:ascii="Century Schoolbook" w:hAnsi="Century Schoolbook"/>
+          <w:bCs/>
+          <w:lang w:val="en-IN"/>
+        </w:rPr>
+      </w:pPr>
+      <w:r>
+        <w:rPr>
+          <w:rFonts w:ascii="Century Schoolbook" w:hAnsi="Century Schoolbook"/>
+          <w:bCs/>
+          <w:lang w:val="en-IN"/>
+        </w:rPr>
+        <w:t xml:space="preserve">9. Output generated word sequence </w:t>
+      </w:r>
+    </w:p>
+    <w:p>
+      <w:pPr>
+        <w:rPr>
+          <w:rFonts w:ascii="Century Schoolbook" w:hAnsi="Century Schoolbook"/>
+          <w:b/>
+          <w:bCs/>
+          <w:sz w:val="24"/>
+          <w:szCs w:val="24"/>
+          <w:lang w:val="en-IN"/>
+        </w:rPr>
+      </w:pPr>
+    </w:p>
+    <w:p>
+      <w:pPr>
+        <w:rPr>
+          <w:rFonts w:ascii="Century Schoolbook" w:hAnsi="Century Schoolbook"/>
+          <w:b/>
+          <w:bCs/>
+          <w:sz w:val="24"/>
+          <w:szCs w:val="24"/>
+          <w:lang w:val="en-IN"/>
+        </w:rPr>
+      </w:pPr>
+    </w:p>
+    <w:p>
+      <w:pPr>
+        <w:rPr>
+          <w:rFonts w:ascii="Century Schoolbook" w:hAnsi="Century Schoolbook"/>
+          <w:b/>
+          <w:bCs/>
+          <w:sz w:val="24"/>
+          <w:szCs w:val="24"/>
+          <w:lang w:val="en-IN"/>
+        </w:rPr>
+      </w:pPr>
+    </w:p>
+    <w:p>
+      <w:pPr>
+        <w:rPr>
+          <w:rFonts w:ascii="Century Schoolbook" w:hAnsi="Century Schoolbook"/>
+          <w:b/>
+          <w:bCs/>
+          <w:sz w:val="24"/>
+          <w:szCs w:val="24"/>
+          <w:lang w:val="en-IN"/>
+        </w:rPr>
+      </w:pPr>
+    </w:p>
+    <w:p>
+      <w:pPr>
+        <w:rPr>
+          <w:rFonts w:ascii="Century Schoolbook" w:hAnsi="Century Schoolbook"/>
+          <w:b/>
+          <w:bCs/>
+          <w:sz w:val="24"/>
+          <w:szCs w:val="24"/>
+          <w:lang w:val="en-IN"/>
+        </w:rPr>
+      </w:pPr>
+    </w:p>
+    <w:p>
+      <w:pPr>
+        <w:rPr>
+          <w:rFonts w:ascii="Century Schoolbook" w:hAnsi="Century Schoolbook"/>
+          <w:b/>
+          <w:bCs/>
+          <w:sz w:val="24"/>
+          <w:szCs w:val="24"/>
+          <w:lang w:val="en-IN"/>
+        </w:rPr>
+      </w:pPr>
+    </w:p>
+    <w:p>
+      <w:pPr>
+        <w:rPr>
+          <w:rFonts w:ascii="Century Schoolbook" w:hAnsi="Century Schoolbook"/>
+          <w:b/>
+          <w:bCs/>
+          <w:sz w:val="24"/>
+          <w:szCs w:val="24"/>
+          <w:lang w:val="en-IN"/>
+        </w:rPr>
+      </w:pPr>
+      <w:r>
+        <w:rPr>
+          <w:rFonts w:ascii="Century Schoolbook" w:hAnsi="Century Schoolbook"/>
+          <w:b/>
+          <w:bCs/>
+          <w:sz w:val="24"/>
+          <w:szCs w:val="24"/>
+          <w:lang w:val="en-IN"/>
+        </w:rPr>
+        <w:lastRenderedPageBreak/>
+        <w:t>Output:</w:t>
+      </w:r>
+    </w:p>
+    <w:p>
+      <w:pPr>
+        <w:rPr>
+          <w:rFonts w:ascii="Century Schoolbook" w:hAnsi="Century Schoolbook"/>
+          <w:b/>
+          <w:bCs/>
+          <w:sz w:val="24"/>
+          <w:szCs w:val="24"/>
+          <w:lang w:val="en-IN"/>
+        </w:rPr>
+      </w:pPr>
+    </w:p>
+    <w:p>
+      <w:pPr>
         <w:rPr>
           <w:rFonts w:ascii="Century Schoolbook" w:hAnsi="Century Schoolbook"/>
           <w:b/>
@@ -20721,10 +20982,10 @@
           <w:lang w:val="en-IN"/>
         </w:rPr>
         <w:drawing>
-          <wp:inline distT="0" distB="0" distL="0" distR="0" wp14:anchorId="2BFD3975" wp14:editId="144E2B5A">
-            <wp:extent cx="5943600" cy="4178935"/>
-            <wp:effectExtent l="0" t="0" r="0" b="0"/>
-            <wp:docPr id="1752295834" name="Picture 1"/>
+          <wp:inline distT="0" distB="0" distL="0" distR="0" wp14:anchorId="40A0C8BD" wp14:editId="4324B04A">
+            <wp:extent cx="6278880" cy="3064308"/>
+            <wp:effectExtent l="0" t="0" r="7620" b="3175"/>
+            <wp:docPr id="1762682415" name="Picture 1"/>
             <wp:cNvGraphicFramePr>
               <a:graphicFrameLocks xmlns:a="http://schemas.openxmlformats.org/drawingml/2006/main" noChangeAspect="1"/>
             </wp:cNvGraphicFramePr>
@@ -20732,7 +20993,7 @@
               <a:graphicData uri="http://schemas.openxmlformats.org/drawingml/2006/picture">
                 <pic:pic xmlns:pic="http://schemas.openxmlformats.org/drawingml/2006/picture">
                   <pic:nvPicPr>
-                    <pic:cNvPr id="1752295834" name=""/>
+                    <pic:cNvPr id="1762682415" name=""/>
                     <pic:cNvPicPr/>
                   </pic:nvPicPr>
                   <pic:blipFill>
@@ -20744,7 +21005,7 @@
                   <pic:spPr>
                     <a:xfrm>
                       <a:off x="0" y="0"/>
-                      <a:ext cx="5943600" cy="4178935"/>
+                      <a:ext cx="6285538" cy="3067557"/>
                     </a:xfrm>
                     <a:prstGeom prst="rect">
                       <a:avLst/>
@@ -20768,21 +21029,44 @@
           <w:lang w:val="en-IN"/>
         </w:rPr>
       </w:pPr>
-      <w:r>
-        <w:rPr>
-          <w:rFonts w:ascii="Century Schoolbook" w:hAnsi="Century Schoolbook"/>
-          <w:b/>
-          <w:bCs/>
-          <w:sz w:val="24"/>
-          <w:szCs w:val="24"/>
-          <w:lang w:val="en-IN"/>
-        </w:rPr>
-        <w:lastRenderedPageBreak/>
+    </w:p>
+    <w:p>
+      <w:pPr>
+        <w:rPr>
+          <w:rFonts w:ascii="Century Schoolbook" w:hAnsi="Century Schoolbook"/>
+          <w:b/>
+          <w:bCs/>
+          <w:sz w:val="24"/>
+          <w:szCs w:val="24"/>
+          <w:lang w:val="en-IN"/>
+        </w:rPr>
+      </w:pPr>
+    </w:p>
+    <w:p>
+      <w:pPr>
+        <w:rPr>
+          <w:rFonts w:ascii="Century Schoolbook" w:hAnsi="Century Schoolbook"/>
+          <w:b/>
+          <w:bCs/>
+          <w:sz w:val="24"/>
+          <w:szCs w:val="24"/>
+          <w:lang w:val="en-IN"/>
+        </w:rPr>
+      </w:pPr>
+      <w:r>
+        <w:rPr>
+          <w:rFonts w:ascii="Century Schoolbook" w:hAnsi="Century Schoolbook"/>
+          <w:b/>
+          <w:bCs/>
+          <w:sz w:val="24"/>
+          <w:szCs w:val="24"/>
+          <w:lang w:val="en-IN"/>
+        </w:rPr>
         <w:drawing>
-          <wp:inline distT="0" distB="0" distL="0" distR="0" wp14:anchorId="0F4FE9E8" wp14:editId="07CD1891">
-            <wp:extent cx="5349704" cy="1531753"/>
-            <wp:effectExtent l="0" t="0" r="3810" b="0"/>
-            <wp:docPr id="2071146439" name="Picture 1"/>
+          <wp:inline distT="0" distB="0" distL="0" distR="0" wp14:anchorId="50D09838" wp14:editId="10F936B1">
+            <wp:extent cx="6232278" cy="3002280"/>
+            <wp:effectExtent l="0" t="0" r="0" b="7620"/>
+            <wp:docPr id="444863557" name="Picture 1"/>
             <wp:cNvGraphicFramePr>
               <a:graphicFrameLocks xmlns:a="http://schemas.openxmlformats.org/drawingml/2006/main" noChangeAspect="1"/>
             </wp:cNvGraphicFramePr>
@@ -20790,7 +21074,7 @@
               <a:graphicData uri="http://schemas.openxmlformats.org/drawingml/2006/picture">
                 <pic:pic xmlns:pic="http://schemas.openxmlformats.org/drawingml/2006/picture">
                   <pic:nvPicPr>
-                    <pic:cNvPr id="2071146439" name=""/>
+                    <pic:cNvPr id="444863557" name=""/>
                     <pic:cNvPicPr/>
                   </pic:nvPicPr>
                   <pic:blipFill>
@@ -20802,7 +21086,7 @@
                   <pic:spPr>
                     <a:xfrm>
                       <a:off x="0" y="0"/>
-                      <a:ext cx="5349704" cy="1531753"/>
+                      <a:ext cx="6232977" cy="3002617"/>
                     </a:xfrm>
                     <a:prstGeom prst="rect">
                       <a:avLst/>
@@ -20826,143 +21110,6 @@
           <w:lang w:val="en-IN"/>
         </w:rPr>
       </w:pPr>
-      <w:r>
-        <w:rPr>
-          <w:rFonts w:ascii="Century Schoolbook" w:hAnsi="Century Schoolbook"/>
-          <w:b/>
-          <w:bCs/>
-          <w:sz w:val="24"/>
-          <w:szCs w:val="24"/>
-          <w:lang w:val="en-IN"/>
-        </w:rPr>
-        <w:drawing>
-          <wp:inline distT="0" distB="0" distL="0" distR="0" wp14:anchorId="6E19D4C7" wp14:editId="7004C40F">
-            <wp:extent cx="4077053" cy="2034716"/>
-            <wp:effectExtent l="0" t="0" r="0" b="3810"/>
-            <wp:docPr id="1645251251" name="Picture 1"/>
-            <wp:cNvGraphicFramePr>
-              <a:graphicFrameLocks xmlns:a="http://schemas.openxmlformats.org/drawingml/2006/main" noChangeAspect="1"/>
-            </wp:cNvGraphicFramePr>
-            <a:graphic xmlns:a="http://schemas.openxmlformats.org/drawingml/2006/main">
-              <a:graphicData uri="http://schemas.openxmlformats.org/drawingml/2006/picture">
-                <pic:pic xmlns:pic="http://schemas.openxmlformats.org/drawingml/2006/picture">
-                  <pic:nvPicPr>
-                    <pic:cNvPr id="1645251251" name=""/>
-                    <pic:cNvPicPr/>
-                  </pic:nvPicPr>
-                  <pic:blipFill>
-                    <a:blip r:embed="rId53"/>
-                    <a:stretch>
-                      <a:fillRect/>
-                    </a:stretch>
-                  </pic:blipFill>
-                  <pic:spPr>
-                    <a:xfrm>
-                      <a:off x="0" y="0"/>
-                      <a:ext cx="4077053" cy="2034716"/>
-                    </a:xfrm>
-                    <a:prstGeom prst="rect">
-                      <a:avLst/>
-                    </a:prstGeom>
-                  </pic:spPr>
-                </pic:pic>
-              </a:graphicData>
-            </a:graphic>
-          </wp:inline>
-        </w:drawing>
-      </w:r>
-    </w:p>
-    <w:p>
-      <w:pPr>
-        <w:rPr>
-          <w:rFonts w:ascii="Century Schoolbook" w:hAnsi="Century Schoolbook"/>
-          <w:b/>
-          <w:bCs/>
-          <w:sz w:val="24"/>
-          <w:szCs w:val="24"/>
-          <w:lang w:val="en-IN"/>
-        </w:rPr>
-      </w:pPr>
-      <w:r>
-        <w:rPr>
-          <w:rFonts w:ascii="Century Schoolbook" w:hAnsi="Century Schoolbook"/>
-          <w:b/>
-          <w:bCs/>
-          <w:sz w:val="24"/>
-          <w:szCs w:val="24"/>
-          <w:lang w:val="en-IN"/>
-        </w:rPr>
-        <w:drawing>
-          <wp:inline distT="0" distB="0" distL="0" distR="0" wp14:anchorId="123D81BD" wp14:editId="5CA6EAED">
-            <wp:extent cx="5022015" cy="3002540"/>
-            <wp:effectExtent l="0" t="0" r="7620" b="7620"/>
-            <wp:docPr id="1261421862" name="Picture 1"/>
-            <wp:cNvGraphicFramePr>
-              <a:graphicFrameLocks xmlns:a="http://schemas.openxmlformats.org/drawingml/2006/main" noChangeAspect="1"/>
-            </wp:cNvGraphicFramePr>
-            <a:graphic xmlns:a="http://schemas.openxmlformats.org/drawingml/2006/main">
-              <a:graphicData uri="http://schemas.openxmlformats.org/drawingml/2006/picture">
-                <pic:pic xmlns:pic="http://schemas.openxmlformats.org/drawingml/2006/picture">
-                  <pic:nvPicPr>
-                    <pic:cNvPr id="1261421862" name=""/>
-                    <pic:cNvPicPr/>
-                  </pic:nvPicPr>
-                  <pic:blipFill>
-                    <a:blip r:embed="rId54"/>
-                    <a:stretch>
-                      <a:fillRect/>
-                    </a:stretch>
-                  </pic:blipFill>
-                  <pic:spPr>
-                    <a:xfrm>
-                      <a:off x="0" y="0"/>
-                      <a:ext cx="5022015" cy="3002540"/>
-                    </a:xfrm>
-                    <a:prstGeom prst="rect">
-                      <a:avLst/>
-                    </a:prstGeom>
-                  </pic:spPr>
-                </pic:pic>
-              </a:graphicData>
-            </a:graphic>
-          </wp:inline>
-        </w:drawing>
-      </w:r>
-    </w:p>
-    <w:p>
-      <w:pPr>
-        <w:rPr>
-          <w:rFonts w:ascii="Century Schoolbook" w:hAnsi="Century Schoolbook"/>
-          <w:b/>
-          <w:bCs/>
-          <w:sz w:val="24"/>
-          <w:szCs w:val="24"/>
-          <w:lang w:val="en-IN"/>
-        </w:rPr>
-      </w:pPr>
-    </w:p>
-    <w:p>
-      <w:pPr>
-        <w:rPr>
-          <w:rFonts w:ascii="Century Schoolbook" w:hAnsi="Century Schoolbook"/>
-          <w:b/>
-          <w:bCs/>
-          <w:sz w:val="24"/>
-          <w:szCs w:val="24"/>
-          <w:lang w:val="en-IN"/>
-        </w:rPr>
-      </w:pPr>
-      <w:r>
-        <w:rPr>
-          <w:rFonts w:ascii="Century Schoolbook" w:hAnsi="Century Schoolbook"/>
-          <w:b/>
-          <w:bCs/>
-          <w:sz w:val="24"/>
-          <w:szCs w:val="24"/>
-          <w:lang w:val="en-IN"/>
-        </w:rPr>
-        <w:t>Output:</w:t>
-      </w:r>
     </w:p>
     <w:p>
       <w:pPr>
@@ -20985,75 +21132,6 @@
           <w:lang w:val="en-IN"/>
         </w:rPr>
         <w:lastRenderedPageBreak/>
-        <w:drawing>
-          <wp:inline distT="0" distB="0" distL="0" distR="0" wp14:anchorId="2D9DA2DD" wp14:editId="137DCB75">
-            <wp:extent cx="3467400" cy="1158340"/>
-            <wp:effectExtent l="0" t="0" r="0" b="3810"/>
-            <wp:docPr id="1193499190" name="Picture 1"/>
-            <wp:cNvGraphicFramePr>
-              <a:graphicFrameLocks xmlns:a="http://schemas.openxmlformats.org/drawingml/2006/main" noChangeAspect="1"/>
-            </wp:cNvGraphicFramePr>
-            <a:graphic xmlns:a="http://schemas.openxmlformats.org/drawingml/2006/main">
-              <a:graphicData uri="http://schemas.openxmlformats.org/drawingml/2006/picture">
-                <pic:pic xmlns:pic="http://schemas.openxmlformats.org/drawingml/2006/picture">
-                  <pic:nvPicPr>
-                    <pic:cNvPr id="1193499190" name=""/>
-                    <pic:cNvPicPr/>
-                  </pic:nvPicPr>
-                  <pic:blipFill>
-                    <a:blip r:embed="rId55"/>
-                    <a:stretch>
-                      <a:fillRect/>
-                    </a:stretch>
-                  </pic:blipFill>
-                  <pic:spPr>
-                    <a:xfrm>
-                      <a:off x="0" y="0"/>
-                      <a:ext cx="3467400" cy="1158340"/>
-                    </a:xfrm>
-                    <a:prstGeom prst="rect">
-                      <a:avLst/>
-                    </a:prstGeom>
-                  </pic:spPr>
-                </pic:pic>
-              </a:graphicData>
-            </a:graphic>
-          </wp:inline>
-        </w:drawing>
-      </w:r>
-    </w:p>
-    <w:p>
-      <w:pPr>
-        <w:rPr>
-          <w:rFonts w:ascii="Century Schoolbook" w:hAnsi="Century Schoolbook"/>
-          <w:b/>
-          <w:bCs/>
-          <w:sz w:val="24"/>
-          <w:szCs w:val="24"/>
-          <w:lang w:val="en-IN"/>
-        </w:rPr>
-      </w:pPr>
-    </w:p>
-    <w:p>
-      <w:pPr>
-        <w:rPr>
-          <w:rFonts w:ascii="Century Schoolbook" w:hAnsi="Century Schoolbook"/>
-          <w:b/>
-          <w:bCs/>
-          <w:sz w:val="24"/>
-          <w:szCs w:val="24"/>
-          <w:lang w:val="en-IN"/>
-        </w:rPr>
-      </w:pPr>
-      <w:r>
-        <w:rPr>
-          <w:rFonts w:ascii="Century Schoolbook" w:hAnsi="Century Schoolbook"/>
-          <w:b/>
-          <w:bCs/>
-          <w:sz w:val="24"/>
-          <w:szCs w:val="24"/>
-          <w:lang w:val="en-IN"/>
-        </w:rPr>
         <w:t>Result:</w:t>
       </w:r>
     </w:p>
@@ -21071,7 +21149,24 @@
           <w:sz w:val="24"/>
           <w:szCs w:val="24"/>
         </w:rPr>
-        <w:t>This experiment demonstrates how word generation depends on grammatical features like gender, number, tense, and case. Hindi shows more variation due to gender and case marking, while English relies more on suffixes and fixed structures. Understanding these rules helps in natural language processing and grammar modeling.</w:t>
+        <w:t>This experiment demonstrates how word generation depends on grammatical features like gender, number, tense, and case.</w:t>
+      </w:r>
+    </w:p>
+    <w:p>
+      <w:pPr>
+        <w:rPr>
+          <w:rFonts w:ascii="Century Schoolbook" w:hAnsi="Century Schoolbook"/>
+          <w:sz w:val="24"/>
+          <w:szCs w:val="24"/>
+        </w:rPr>
+      </w:pPr>
+      <w:r>
+        <w:rPr>
+          <w:rFonts w:ascii="Century Schoolbook" w:hAnsi="Century Schoolbook"/>
+          <w:sz w:val="24"/>
+          <w:szCs w:val="24"/>
+        </w:rPr>
+        <w:t xml:space="preserve"> Hindi shows more variation due to gender and case marking, while English relies more on suffixes and fixed structures. Understanding these rules helps in natural language processing and grammar modeling.</w:t>
       </w:r>
     </w:p>
     <w:p>
@@ -21124,7 +21219,7 @@
         </w:rPr>
         <w:t>1.</w:t>
       </w:r>
-      <w:hyperlink r:id="rId56" w:history="1">
+      <w:hyperlink r:id="rId53" w:history="1">
         <w:r>
           <w:rPr>
             <w:rStyle w:val="Hyperlink"/>
@@ -21150,7 +21245,7 @@
         </w:rPr>
         <w:t>2.</w:t>
       </w:r>
-      <w:hyperlink r:id="rId57" w:history="1">
+      <w:hyperlink r:id="rId54" w:history="1">
         <w:r>
           <w:rPr>
             <w:rStyle w:val="Hyperlink"/>
@@ -21176,7 +21271,7 @@
         </w:rPr>
         <w:t xml:space="preserve">3. </w:t>
       </w:r>
-      <w:hyperlink r:id="rId58" w:history="1">
+      <w:hyperlink r:id="rId55" w:history="1">
         <w:r>
           <w:rPr>
             <w:rStyle w:val="Hyperlink"/>
@@ -21242,8 +21337,8 @@
       </w:pPr>
     </w:p>
     <w:sectPr>
-      <w:headerReference w:type="default" r:id="rId59"/>
-      <w:footerReference w:type="default" r:id="rId60"/>
+      <w:headerReference w:type="default" r:id="rId56"/>
+      <w:footerReference w:type="default" r:id="rId57"/>
       <w:pgSz w:w="12240" w:h="15840"/>
       <w:pgMar w:top="1440" w:right="1440" w:bottom="1440" w:left="1440" w:header="708" w:footer="340" w:gutter="0"/>
       <w:pgBorders w:offsetFrom="page">
@@ -24570,7 +24665,7 @@
     <w:lsdException w:name="Closing" w:semiHidden="1" w:unhideWhenUsed="1"/>
     <w:lsdException w:name="Signature" w:semiHidden="1" w:unhideWhenUsed="1"/>
     <w:lsdException w:name="Default Paragraph Font" w:semiHidden="1" w:uiPriority="1" w:unhideWhenUsed="1"/>
-    <w:lsdException w:name="Body Text" w:semiHidden="1" w:unhideWhenUsed="1"/>
+    <w:lsdException w:name="Body Text" w:semiHidden="1" w:uiPriority="1" w:unhideWhenUsed="1" w:qFormat="1"/>
     <w:lsdException w:name="Body Text Indent" w:semiHidden="1" w:unhideWhenUsed="1"/>
     <w:lsdException w:name="List Continue" w:semiHidden="1" w:unhideWhenUsed="1"/>
     <w:lsdException w:name="List Continue 2" w:semiHidden="1" w:unhideWhenUsed="1"/>
@@ -24889,6 +24984,7 @@
   <w:style w:type="character" w:default="1" w:styleId="DefaultParagraphFont">
     <w:name w:val="Default Paragraph Font"/>
     <w:uiPriority w:val="1"/>
+    <w:semiHidden/>
     <w:unhideWhenUsed/>
   </w:style>
   <w:style w:type="table" w:default="1" w:styleId="TableNormal">
@@ -25047,6 +25143,37 @@
       <w:rFonts w:ascii="Courier New" w:eastAsia="Times New Roman" w:hAnsi="Courier New" w:cs="Courier New"/>
       <w:sz w:val="20"/>
       <w:szCs w:val="20"/>
+    </w:rPr>
+  </w:style>
+  <w:style w:type="paragraph" w:styleId="BodyText">
+    <w:name w:val="Body Text"/>
+    <w:basedOn w:val="Normal"/>
+    <w:link w:val="BodyTextChar"/>
+    <w:uiPriority w:val="1"/>
+    <w:qFormat/>
+    <w:rsid w:val="0037710A"/>
+    <w:pPr>
+      <w:widowControl w:val="0"/>
+      <w:autoSpaceDE w:val="0"/>
+      <w:autoSpaceDN w:val="0"/>
+      <w:spacing w:after="0" w:line="240" w:lineRule="auto"/>
+    </w:pPr>
+    <w:rPr>
+      <w:rFonts w:ascii="Arial MT" w:eastAsia="Arial MT" w:hAnsi="Arial MT" w:cs="Arial MT"/>
+      <w:sz w:val="24"/>
+      <w:szCs w:val="24"/>
+    </w:rPr>
+  </w:style>
+  <w:style w:type="character" w:customStyle="1" w:styleId="BodyTextChar">
+    <w:name w:val="Body Text Char"/>
+    <w:basedOn w:val="DefaultParagraphFont"/>
+    <w:link w:val="BodyText"/>
+    <w:uiPriority w:val="1"/>
+    <w:rsid w:val="0037710A"/>
+    <w:rPr>
+      <w:rFonts w:ascii="Arial MT" w:eastAsia="Arial MT" w:hAnsi="Arial MT" w:cs="Arial MT"/>
+      <w:sz w:val="24"/>
+      <w:szCs w:val="24"/>
     </w:rPr>
   </w:style>
 </w:styles>

</xml_diff>